<commit_message>
docs(resume): make contact URLs clickable (keep full URL visible)
Wrap the email/LinkedIn/GitHub/portfolio URLs in hyperlinks while keeping the
full URL as the visible text — ATS-safe (survives link stripping / plain-text
conversion) and click-through for humans. Verified link annotations in the PDF
and hyperlink relationships in the DOCX.

Co-Authored-By: Claude Opus 4.8 (1M context) <noreply@anthropic.com>
</commit_message>
<xml_diff>
--- a/public/resume/Shivam_Gupta_Resume.docx
+++ b/public/resume/Shivam_Gupta_Resume.docx
@@ -51,17 +51,38 @@
         <w:spacing w:before="75" w:after="60"/>
         <w:ind w:hanging="0" w:left="0" w:right="0"/>
         <w:jc w:val="left"/>
+        <w:rPr/>
+      </w:pPr>
+      <w:hyperlink r:id="rId2">
+        <w:r>
+          <w:rPr>
+            <w:rStyle w:val="Hyperlink"/>
+            <w:color w:val="222222"/>
+            <w:sz w:val="19"/>
+          </w:rPr>
+          <w:t>profile.shivam@gmail.com</w:t>
+        </w:r>
+      </w:hyperlink>
+      <w:r>
         <w:rPr>
           <w:color w:val="222222"/>
           <w:sz w:val="19"/>
         </w:rPr>
-      </w:pPr>
+        <w:t xml:space="preserve"> </w:t>
+      </w:r>
+      <w:r>
+        <w:rPr>
+          <w:color w:val="888888"/>
+          <w:sz w:val="19"/>
+        </w:rPr>
+        <w:t>•</w:t>
+      </w:r>
       <w:r>
         <w:rPr>
           <w:color w:val="222222"/>
           <w:sz w:val="19"/>
         </w:rPr>
-        <w:t xml:space="preserve">profile.shivam@gmail.com </w:t>
+        <w:t xml:space="preserve"> +91-7014217098 </w:t>
       </w:r>
       <w:r>
         <w:rPr>
@@ -75,7 +96,25 @@
           <w:color w:val="222222"/>
           <w:sz w:val="19"/>
         </w:rPr>
-        <w:t xml:space="preserve"> +91-7014217098 </w:t>
+        <w:t xml:space="preserve"> Jaipur, India</w:t>
+        <w:br/>
+      </w:r>
+      <w:hyperlink r:id="rId3">
+        <w:r>
+          <w:rPr>
+            <w:rStyle w:val="Hyperlink"/>
+            <w:color w:val="222222"/>
+            <w:sz w:val="19"/>
+          </w:rPr>
+          <w:t>linkedin.com/in/myselfshivam</w:t>
+        </w:r>
+      </w:hyperlink>
+      <w:r>
+        <w:rPr>
+          <w:color w:val="222222"/>
+          <w:sz w:val="19"/>
+        </w:rPr>
+        <w:t xml:space="preserve"> </w:t>
       </w:r>
       <w:r>
         <w:rPr>
@@ -89,9 +128,24 @@
           <w:color w:val="222222"/>
           <w:sz w:val="19"/>
         </w:rPr>
-        <w:t xml:space="preserve"> Jaipur, India</w:t>
-        <w:br/>
-        <w:t xml:space="preserve">linkedin.com/in/myselfshivam </w:t>
+        <w:t xml:space="preserve"> </w:t>
+      </w:r>
+      <w:hyperlink r:id="rId4">
+        <w:r>
+          <w:rPr>
+            <w:rStyle w:val="Hyperlink"/>
+            <w:color w:val="222222"/>
+            <w:sz w:val="19"/>
+          </w:rPr>
+          <w:t>github.com/shivamgupta1319</w:t>
+        </w:r>
+      </w:hyperlink>
+      <w:r>
+        <w:rPr>
+          <w:color w:val="222222"/>
+          <w:sz w:val="19"/>
+        </w:rPr>
+        <w:t xml:space="preserve"> </w:t>
       </w:r>
       <w:r>
         <w:rPr>
@@ -105,21 +159,24 @@
           <w:color w:val="222222"/>
           <w:sz w:val="19"/>
         </w:rPr>
-        <w:t xml:space="preserve"> github.com/shivamgupta1319 </w:t>
-      </w:r>
-      <w:r>
-        <w:rPr>
-          <w:color w:val="888888"/>
-          <w:sz w:val="19"/>
-        </w:rPr>
-        <w:t>•</w:t>
-      </w:r>
+        <w:t xml:space="preserve"> </w:t>
+      </w:r>
+      <w:hyperlink r:id="rId5">
+        <w:r>
+          <w:rPr>
+            <w:rStyle w:val="Hyperlink"/>
+            <w:color w:val="222222"/>
+            <w:sz w:val="19"/>
+          </w:rPr>
+          <w:t>ershivam.netlify.app</w:t>
+        </w:r>
+      </w:hyperlink>
       <w:r>
         <w:rPr>
           <w:color w:val="222222"/>
           <w:sz w:val="19"/>
         </w:rPr>
-        <w:t xml:space="preserve"> ershivam.netlify.app </w:t>
+        <w:t xml:space="preserve"> </w:t>
       </w:r>
     </w:p>
     <w:p>

</xml_diff>

<commit_message>
feat(resume): update resume files in DOCX and PDF formats
</commit_message>
<xml_diff>
--- a/public/resume/Shivam_Gupta_Resume.docx
+++ b/public/resume/Shivam_Gupta_Resume.docx
@@ -2704,8 +2704,6 @@
         </w:rPr>
         <w:fldChar w:fldCharType="end"/>
       </w:r>
-      <w:bookmarkStart w:id="0" w:name="_GoBack"/>
-      <w:bookmarkEnd w:id="0"/>
     </w:p>
     <w:p>
       <w:pPr>
@@ -4818,10 +4816,13 @@
       </w:r>
       <w:r>
         <w:rPr>
-          <w:color w:val="111111"/>
-          <w:sz w:val="20"/>
-        </w:rPr>
-        <w:t>two</w:t>
+          <w:rFonts w:hint="default"/>
+          <w:color w:val="111111"/>
+          <w:spacing w:val="8"/>
+          <w:sz w:val="20"/>
+          <w:lang w:val="en-US"/>
+        </w:rPr>
+        <w:t>three</w:t>
       </w:r>
       <w:r>
         <w:rPr>
@@ -4905,6 +4906,35 @@
           <w:sz w:val="20"/>
         </w:rPr>
         <w:t>(pseo.cloud)</w:t>
+      </w:r>
+      <w:r>
+        <w:rPr>
+          <w:rFonts w:hint="default"/>
+          <w:color w:val="111111"/>
+          <w:sz w:val="20"/>
+          <w:lang w:val="en-US"/>
+        </w:rPr>
+        <w:t xml:space="preserve">, </w:t>
+      </w:r>
+      <w:r>
+        <w:rPr>
+          <w:rFonts w:hint="default"/>
+          <w:b/>
+          <w:bCs/>
+          <w:color w:val="111111"/>
+          <w:sz w:val="20"/>
+          <w:lang w:val="en-US"/>
+        </w:rPr>
+        <w:t>Resite</w:t>
+      </w:r>
+      <w:r>
+        <w:rPr>
+          <w:rFonts w:hint="default"/>
+          <w:color w:val="111111"/>
+          <w:sz w:val="20"/>
+          <w:lang w:val="en-US"/>
+        </w:rPr>
+        <w:t xml:space="preserve"> (resite.live),</w:t>
       </w:r>
       <w:r>
         <w:rPr>
@@ -5304,6 +5334,8 @@
         </w:rPr>
         <w:t>AI</w:t>
       </w:r>
+      <w:bookmarkStart w:id="0" w:name="_GoBack"/>
+      <w:bookmarkEnd w:id="0"/>
       <w:r>
         <w:rPr>
           <w:color w:val="111111"/>

</xml_diff>